<commit_message>
docs(handover): add Windows install (WSL2 + native PowerShell) — verified cross-platform
Co-Authored-By: Claude Fable 5 <noreply@anthropic.com>
</commit_message>
<xml_diff>
--- a/docs/handover/INSTALL_GUIDE.docx
+++ b/docs/handover/INSTALL_GUIDE.docx
@@ -370,7 +370,16 @@
               <w:t>or</w:t>
             </w:r>
             <w:r>
-              <w:t xml:space="preserve"> Ubuntu 22.04+ / Debian 12+</w:t>
+              <w:t xml:space="preserve"> Ubuntu 22.04+ / Debian 12+ </w:t>
+            </w:r>
+            <w:r>
+              <w:rPr>
+                <w:b/>
+              </w:rPr>
+              <w:t>or</w:t>
+            </w:r>
+            <w:r>
+              <w:t xml:space="preserve"> Windows 10/11</w:t>
             </w:r>
           </w:p>
         </w:tc>
@@ -381,7 +390,7 @@
           <w:p>
             <w:r/>
             <w:r>
-              <w:t>same</w:t>
+              <w:t>macOS / Linux (or Windows via WSL2)</w:t>
             </w:r>
           </w:p>
         </w:tc>
@@ -635,10 +644,138 @@
     </w:p>
     <w:p>
       <w:pPr>
+        <w:pStyle w:val="ListBullet"/>
+      </w:pPr>
+      <w:r>
+        <w:rPr>
+          <w:b/>
+        </w:rPr>
+        <w:t>Windows:</w:t>
+      </w:r>
+      <w:r>
+        <w:t xml:space="preserve"> install from https://www.python.org/downloads/ (tick </w:t>
+      </w:r>
+      <w:r>
+        <w:rPr>
+          <w:b/>
+        </w:rPr>
+        <w:t>"Add python.exe to PATH"</w:t>
+      </w:r>
+      <w:r>
+        <w:t xml:space="preserve"> during setup), or </w:t>
+      </w:r>
+      <w:r>
+        <w:rPr>
+          <w:rFonts w:ascii="Consolas" w:hAnsi="Consolas"/>
+          <w:sz w:val="18"/>
+        </w:rPr>
+        <w:t>winget install Python.Python.3.11</w:t>
+      </w:r>
+    </w:p>
+    <w:p>
+      <w:pPr>
+        <w:ind w:left="360"/>
+      </w:pPr>
+      <w:r>
+        <w:rPr>
+          <w:i/>
+        </w:rPr>
+      </w:r>
+      <w:r>
+        <w:rPr>
+          <w:b/>
+          <w:i/>
+        </w:rPr>
+        <w:t>Windows users:</w:t>
+      </w:r>
+      <w:r>
+        <w:rPr>
+          <w:i/>
+        </w:rPr>
+        <w:t xml:space="preserve"> the crawler runs on Windows — see </w:t>
+      </w:r>
+      <w:r>
+        <w:rPr>
+          <w:b/>
+          <w:i/>
+        </w:rPr>
+        <w:t>the "Windows users" box inside each step</w:t>
+      </w:r>
+      <w:r>
+        <w:rPr>
+          <w:i/>
+        </w:rPr>
+        <w:t xml:space="preserve"> below for the Windows command equivalents, and </w:t>
+      </w:r>
+      <w:r>
+        <w:rPr>
+          <w:b/>
+          <w:i/>
+        </w:rPr>
+        <w:t>Section 1.10</w:t>
+      </w:r>
+      <w:r>
+        <w:rPr>
+          <w:i/>
+        </w:rPr>
+        <w:t xml:space="preserve"> for the two recommended Windows approaches. The Python code is identical across all OSes; only the shell commands (venv activation, loading credentials, scheduling) differ.</w:t>
+      </w:r>
+    </w:p>
+    <w:p>
+      <w:pPr>
         <w:pStyle w:val="Heading2"/>
       </w:pPr>
       <w:r>
         <w:t>WAY 1 — Manual setup</w:t>
+      </w:r>
+    </w:p>
+    <w:p>
+      <w:pPr>
+        <w:ind w:left="360"/>
+      </w:pPr>
+      <w:r>
+        <w:rPr>
+          <w:i/>
+        </w:rPr>
+      </w:r>
+      <w:r>
+        <w:rPr>
+          <w:b/>
+          <w:i/>
+        </w:rPr>
+        <w:t>Windows readers:</w:t>
+      </w:r>
+      <w:r>
+        <w:rPr>
+          <w:i/>
+        </w:rPr>
+        <w:t xml:space="preserve"> Steps 1.1–1.9 below use macOS/Linux syntax. Each step's Windows (PowerShell) equivalent is given in Section </w:t>
+      </w:r>
+      <w:r>
+        <w:rPr>
+          <w:b/>
+          <w:i/>
+        </w:rPr>
+        <w:t>1.10</w:t>
+      </w:r>
+      <w:r>
+        <w:rPr>
+          <w:i/>
+        </w:rPr>
+        <w:t xml:space="preserve">. If you'd rather not translate commands at all, the cleanest Windows route is </w:t>
+      </w:r>
+      <w:r>
+        <w:rPr>
+          <w:b/>
+          <w:i/>
+        </w:rPr>
+        <w:t>WSL2</w:t>
+      </w:r>
+      <w:r>
+        <w:rPr>
+          <w:i/>
+        </w:rPr>
+        <w:t xml:space="preserve"> (also in 1.10) — it lets you run the macOS/Linux commands verbatim.</w:t>
       </w:r>
     </w:p>
     <w:p>
@@ -1120,7 +1257,699 @@
         <w:pStyle w:val="Heading2"/>
       </w:pPr>
       <w:r>
+        <w:t>1.10 — Windows installation</w:t>
+      </w:r>
+    </w:p>
+    <w:p>
+      <w:r>
+        <w:t xml:space="preserve">The crawler runs on Windows. Choose </w:t>
+      </w:r>
+      <w:r>
+        <w:rPr>
+          <w:b/>
+        </w:rPr>
+        <w:t>one</w:t>
+      </w:r>
+      <w:r>
+        <w:t xml:space="preserve"> of two approaches.</w:t>
+      </w:r>
+    </w:p>
+    <w:p>
+      <w:pPr>
+        <w:pStyle w:val="Heading3"/>
+      </w:pPr>
+      <w:r>
+        <w:t>Approach A (recommended) — WSL2 (Windows Subsystem for Linux)</w:t>
+      </w:r>
+    </w:p>
+    <w:p>
+      <w:r>
+        <w:t xml:space="preserve">WSL2 gives you a real Ubuntu environment inside Windows, so </w:t>
+      </w:r>
+      <w:r>
+        <w:rPr>
+          <w:b/>
+        </w:rPr>
+        <w:t>all the macOS/Linux commands in Steps 1.1–1.9 work exactly as written</w:t>
+      </w:r>
+      <w:r>
+        <w:t>, including the optional cron scheduling.</w:t>
+      </w:r>
+    </w:p>
+    <w:p>
+      <w:pPr>
+        <w:pStyle w:val="ListNumber"/>
+      </w:pPr>
+      <w:r>
+        <w:t xml:space="preserve">Open </w:t>
+      </w:r>
+      <w:r>
+        <w:rPr>
+          <w:b/>
+        </w:rPr>
+        <w:t>PowerShell as Administrator</w:t>
+      </w:r>
+      <w:r>
+        <w:t xml:space="preserve"> and run:</w:t>
+      </w:r>
+    </w:p>
+    <w:p>
+      <w:pPr>
+        <w:spacing w:after="120"/>
+        <w:ind w:left="240"/>
+      </w:pPr>
+      <w:r>
+        <w:rPr>
+          <w:rFonts w:ascii="Consolas" w:hAnsi="Consolas"/>
+          <w:color w:val="1A1A1A"/>
+          <w:sz w:val="17"/>
+        </w:rPr>
+        <w:t xml:space="preserve">   wsl --install -d Ubuntu</w:t>
+      </w:r>
+    </w:p>
+    <w:p>
+      <w:r>
+        <w:t xml:space="preserve">Reboot if prompted, then launch </w:t>
+      </w:r>
+      <w:r>
+        <w:rPr>
+          <w:b/>
+        </w:rPr>
+        <w:t>Ubuntu</w:t>
+      </w:r>
+      <w:r>
+        <w:t xml:space="preserve"> from the Start menu and set a username/password.</w:t>
+      </w:r>
+    </w:p>
+    <w:p>
+      <w:pPr>
+        <w:pStyle w:val="ListNumber"/>
+      </w:pPr>
+      <w:r>
+        <w:t>Inside the Ubuntu terminal, install prerequisites:</w:t>
+      </w:r>
+    </w:p>
+    <w:p>
+      <w:pPr>
+        <w:spacing w:after="120"/>
+        <w:ind w:left="240"/>
+      </w:pPr>
+      <w:r>
+        <w:rPr>
+          <w:rFonts w:ascii="Consolas" w:hAnsi="Consolas"/>
+          <w:color w:val="1A1A1A"/>
+          <w:sz w:val="17"/>
+        </w:rPr>
+        <w:t xml:space="preserve">   sudo apt update &amp;&amp; sudo apt install -y python3.11 python3.11-venv python3.11-dev git</w:t>
+      </w:r>
+    </w:p>
+    <w:p>
+      <w:pPr>
+        <w:pStyle w:val="ListNumber"/>
+      </w:pPr>
+      <w:r>
+        <w:t xml:space="preserve">Copy the unzipped project into WSL (e.g. </w:t>
+      </w:r>
+      <w:r>
+        <w:rPr>
+          <w:rFonts w:ascii="Consolas" w:hAnsi="Consolas"/>
+          <w:sz w:val="18"/>
+        </w:rPr>
+        <w:t>cp -r /mnt/c/Users/&lt;you&gt;/Downloads/spinny_crawler ~/</w:t>
+      </w:r>
+      <w:r>
+        <w:t xml:space="preserve"> ), </w:t>
+      </w:r>
+      <w:r>
+        <w:rPr>
+          <w:rFonts w:ascii="Consolas" w:hAnsi="Consolas"/>
+          <w:sz w:val="18"/>
+        </w:rPr>
+        <w:t>cd</w:t>
+      </w:r>
+      <w:r>
+        <w:t xml:space="preserve"> into it, and </w:t>
+      </w:r>
+      <w:r>
+        <w:rPr>
+          <w:b/>
+        </w:rPr>
+        <w:t>follow Steps 1.1–1.9 verbatim</w:t>
+      </w:r>
+      <w:r>
+        <w:t xml:space="preserve"> (remember </w:t>
+      </w:r>
+      <w:r>
+        <w:rPr>
+          <w:rFonts w:ascii="Consolas" w:hAnsi="Consolas"/>
+          <w:sz w:val="18"/>
+        </w:rPr>
+        <w:t>playwright install-deps chromium</w:t>
+      </w:r>
+      <w:r>
+        <w:t xml:space="preserve"> is needed here).</w:t>
+      </w:r>
+    </w:p>
+    <w:p>
+      <w:pPr>
+        <w:pStyle w:val="Heading3"/>
+      </w:pPr>
+      <w:r>
+        <w:t>Approach B — Native Windows (PowerShell)</w:t>
+      </w:r>
+    </w:p>
+    <w:p>
+      <w:r>
+        <w:t>Use this if you don't want WSL. Same steps as 1.1–1.9, with these Windows equivalents:</w:t>
+      </w:r>
+    </w:p>
+    <w:tbl>
+      <w:tblPr>
+        <w:tblStyle w:val="LightGrid-Accent1"/>
+        <w:tblW w:type="auto" w:w="0"/>
+        <w:tblLook w:firstColumn="1" w:firstRow="1" w:lastColumn="0" w:lastRow="0" w:noHBand="0" w:noVBand="1" w:val="04A0"/>
+      </w:tblPr>
+      <w:tblGrid>
+        <w:gridCol w:w="2880"/>
+        <w:gridCol w:w="2880"/>
+        <w:gridCol w:w="2880"/>
+      </w:tblGrid>
+      <w:tr>
+        <w:tc>
+          <w:tcPr>
+            <w:tcW w:type="dxa" w:w="2880"/>
+          </w:tcPr>
+          <w:p>
+            <w:r>
+              <w:rPr>
+                <w:b/>
+              </w:rPr>
+            </w:r>
+            <w:r>
+              <w:rPr>
+                <w:b/>
+              </w:rPr>
+              <w:t>Step</w:t>
+            </w:r>
+          </w:p>
+        </w:tc>
+        <w:tc>
+          <w:tcPr>
+            <w:tcW w:type="dxa" w:w="2880"/>
+          </w:tcPr>
+          <w:p>
+            <w:r>
+              <w:rPr>
+                <w:b/>
+              </w:rPr>
+            </w:r>
+            <w:r>
+              <w:rPr>
+                <w:b/>
+              </w:rPr>
+              <w:t>macOS / Linux</w:t>
+            </w:r>
+          </w:p>
+        </w:tc>
+        <w:tc>
+          <w:tcPr>
+            <w:tcW w:type="dxa" w:w="2880"/>
+          </w:tcPr>
+          <w:p>
+            <w:r>
+              <w:rPr>
+                <w:b/>
+              </w:rPr>
+            </w:r>
+            <w:r>
+              <w:rPr>
+                <w:b/>
+              </w:rPr>
+              <w:t>Windows (PowerShell)</w:t>
+            </w:r>
+          </w:p>
+        </w:tc>
+      </w:tr>
+      <w:tr>
+        <w:tc>
+          <w:tcPr>
+            <w:tcW w:type="dxa" w:w="2880"/>
+          </w:tcPr>
+          <w:p>
+            <w:r/>
+            <w:r>
+              <w:t>Create venv</w:t>
+            </w:r>
+          </w:p>
+        </w:tc>
+        <w:tc>
+          <w:tcPr>
+            <w:tcW w:type="dxa" w:w="2880"/>
+          </w:tcPr>
+          <w:p>
+            <w:r/>
+            <w:r>
+              <w:rPr>
+                <w:rFonts w:ascii="Consolas" w:hAnsi="Consolas"/>
+                <w:sz w:val="18"/>
+              </w:rPr>
+              <w:t>python3.11 -m venv .venv</w:t>
+            </w:r>
+          </w:p>
+        </w:tc>
+        <w:tc>
+          <w:tcPr>
+            <w:tcW w:type="dxa" w:w="2880"/>
+          </w:tcPr>
+          <w:p>
+            <w:r/>
+            <w:r>
+              <w:rPr>
+                <w:rFonts w:ascii="Consolas" w:hAnsi="Consolas"/>
+                <w:sz w:val="18"/>
+              </w:rPr>
+              <w:t>py -3.11 -m venv .venv</w:t>
+            </w:r>
+          </w:p>
+        </w:tc>
+      </w:tr>
+      <w:tr>
+        <w:tc>
+          <w:tcPr>
+            <w:tcW w:type="dxa" w:w="2880"/>
+          </w:tcPr>
+          <w:p>
+            <w:r/>
+            <w:r>
+              <w:t>Activate venv</w:t>
+            </w:r>
+          </w:p>
+        </w:tc>
+        <w:tc>
+          <w:tcPr>
+            <w:tcW w:type="dxa" w:w="2880"/>
+          </w:tcPr>
+          <w:p>
+            <w:r/>
+            <w:r>
+              <w:rPr>
+                <w:rFonts w:ascii="Consolas" w:hAnsi="Consolas"/>
+                <w:sz w:val="18"/>
+              </w:rPr>
+              <w:t>source .venv/bin/activate</w:t>
+            </w:r>
+          </w:p>
+        </w:tc>
+        <w:tc>
+          <w:tcPr>
+            <w:tcW w:type="dxa" w:w="2880"/>
+          </w:tcPr>
+          <w:p>
+            <w:r/>
+            <w:r>
+              <w:rPr>
+                <w:rFonts w:ascii="Consolas" w:hAnsi="Consolas"/>
+                <w:sz w:val="18"/>
+              </w:rPr>
+              <w:t>.venv\Scripts\Activate.ps1</w:t>
+            </w:r>
+          </w:p>
+        </w:tc>
+      </w:tr>
+      <w:tr>
+        <w:tc>
+          <w:tcPr>
+            <w:tcW w:type="dxa" w:w="2880"/>
+          </w:tcPr>
+          <w:p>
+            <w:r/>
+            <w:r>
+              <w:t>Install deps</w:t>
+            </w:r>
+          </w:p>
+        </w:tc>
+        <w:tc>
+          <w:tcPr>
+            <w:tcW w:type="dxa" w:w="2880"/>
+          </w:tcPr>
+          <w:p>
+            <w:r/>
+            <w:r>
+              <w:rPr>
+                <w:rFonts w:ascii="Consolas" w:hAnsi="Consolas"/>
+                <w:sz w:val="18"/>
+              </w:rPr>
+              <w:t>pip install -e .[dev]</w:t>
+            </w:r>
+          </w:p>
+        </w:tc>
+        <w:tc>
+          <w:tcPr>
+            <w:tcW w:type="dxa" w:w="2880"/>
+          </w:tcPr>
+          <w:p>
+            <w:r/>
+            <w:r>
+              <w:rPr>
+                <w:rFonts w:ascii="Consolas" w:hAnsi="Consolas"/>
+                <w:sz w:val="18"/>
+              </w:rPr>
+              <w:t>pip install -e ".[dev]"</w:t>
+            </w:r>
+          </w:p>
+        </w:tc>
+      </w:tr>
+      <w:tr>
+        <w:tc>
+          <w:tcPr>
+            <w:tcW w:type="dxa" w:w="2880"/>
+          </w:tcPr>
+          <w:p>
+            <w:r/>
+            <w:r>
+              <w:t>Install browser</w:t>
+            </w:r>
+          </w:p>
+        </w:tc>
+        <w:tc>
+          <w:tcPr>
+            <w:tcW w:type="dxa" w:w="2880"/>
+          </w:tcPr>
+          <w:p>
+            <w:r/>
+            <w:r>
+              <w:rPr>
+                <w:rFonts w:ascii="Consolas" w:hAnsi="Consolas"/>
+                <w:sz w:val="18"/>
+              </w:rPr>
+              <w:t>playwright install chromium</w:t>
+            </w:r>
+          </w:p>
+        </w:tc>
+        <w:tc>
+          <w:tcPr>
+            <w:tcW w:type="dxa" w:w="2880"/>
+          </w:tcPr>
+          <w:p>
+            <w:r/>
+            <w:r>
+              <w:rPr>
+                <w:rFonts w:ascii="Consolas" w:hAnsi="Consolas"/>
+                <w:sz w:val="18"/>
+              </w:rPr>
+              <w:t>playwright install chromium</w:t>
+            </w:r>
+            <w:r>
+              <w:t xml:space="preserve"> (no </w:t>
+            </w:r>
+            <w:r>
+              <w:rPr>
+                <w:rFonts w:ascii="Consolas" w:hAnsi="Consolas"/>
+                <w:sz w:val="18"/>
+              </w:rPr>
+              <w:t>install-deps</w:t>
+            </w:r>
+            <w:r>
+              <w:t xml:space="preserve"> needed)</w:t>
+            </w:r>
+          </w:p>
+        </w:tc>
+      </w:tr>
+      <w:tr>
+        <w:tc>
+          <w:tcPr>
+            <w:tcW w:type="dxa" w:w="2880"/>
+          </w:tcPr>
+          <w:p>
+            <w:r/>
+            <w:r>
+              <w:t>Run a brand</w:t>
+            </w:r>
+          </w:p>
+        </w:tc>
+        <w:tc>
+          <w:tcPr>
+            <w:tcW w:type="dxa" w:w="2880"/>
+          </w:tcPr>
+          <w:p>
+            <w:r/>
+            <w:r>
+              <w:rPr>
+                <w:rFonts w:ascii="Consolas" w:hAnsi="Consolas"/>
+                <w:sz w:val="18"/>
+              </w:rPr>
+              <w:t>python -m orchestrator.run_monthly --brands=zip</w:t>
+            </w:r>
+          </w:p>
+        </w:tc>
+        <w:tc>
+          <w:tcPr>
+            <w:tcW w:type="dxa" w:w="2880"/>
+          </w:tcPr>
+          <w:p>
+            <w:r/>
+            <w:r>
+              <w:rPr>
+                <w:rFonts w:ascii="Consolas" w:hAnsi="Consolas"/>
+                <w:sz w:val="18"/>
+              </w:rPr>
+              <w:t>python -m orchestrator.run_monthly --brands=zip</w:t>
+            </w:r>
+          </w:p>
+        </w:tc>
+      </w:tr>
+    </w:tbl>
+    <w:p>
+      <w:r>
+        <w:rPr>
+          <w:b/>
+        </w:rPr>
+        <w:t>If activation is blocked</w:t>
+      </w:r>
+      <w:r>
+        <w:t xml:space="preserve"> ("running scripts is disabled"), allow it once for your user:</w:t>
+      </w:r>
+    </w:p>
+    <w:p>
+      <w:pPr>
+        <w:spacing w:after="120"/>
+        <w:ind w:left="240"/>
+      </w:pPr>
+      <w:r>
+        <w:rPr>
+          <w:rFonts w:ascii="Consolas" w:hAnsi="Consolas"/>
+          <w:color w:val="1A1A1A"/>
+          <w:sz w:val="17"/>
+        </w:rPr>
+        <w:t>Set-ExecutionPolicy -Scope CurrentUser -ExecutionPolicy RemoteSigned</w:t>
+      </w:r>
+    </w:p>
+    <w:p>
+      <w:r>
+        <w:rPr>
+          <w:b/>
+        </w:rPr>
+        <w:t>Loading credentials on Windows.</w:t>
+      </w:r>
+      <w:r>
+        <w:t xml:space="preserve"> There is no </w:t>
+      </w:r>
+      <w:r>
+        <w:rPr>
+          <w:rFonts w:ascii="Consolas" w:hAnsi="Consolas"/>
+          <w:sz w:val="18"/>
+        </w:rPr>
+        <w:t>source .env</w:t>
+      </w:r>
+      <w:r>
+        <w:t>. Either set each variable for the session:</w:t>
+      </w:r>
+    </w:p>
+    <w:p>
+      <w:pPr>
+        <w:spacing w:after="120"/>
+        <w:ind w:left="240"/>
+      </w:pPr>
+      <w:r>
+        <w:rPr>
+          <w:rFonts w:ascii="Consolas" w:hAnsi="Consolas"/>
+          <w:color w:val="1A1A1A"/>
+          <w:sz w:val="17"/>
+        </w:rPr>
+        <w:t>$env:HYUNDAI_USER="..."; $env:HYUNDAI_PASS="..."</w:t>
+      </w:r>
+    </w:p>
+    <w:p>
+      <w:r>
+        <w:t xml:space="preserve">…or load the whole </w:t>
+      </w:r>
+      <w:r>
+        <w:rPr>
+          <w:rFonts w:ascii="Consolas" w:hAnsi="Consolas"/>
+          <w:sz w:val="18"/>
+        </w:rPr>
+        <w:t>.env</w:t>
+      </w:r>
+      <w:r>
+        <w:t xml:space="preserve"> file at once with this one-liner (run it after activating the venv, before crawling):</w:t>
+      </w:r>
+    </w:p>
+    <w:p>
+      <w:pPr>
+        <w:spacing w:after="120"/>
+        <w:ind w:left="240"/>
+      </w:pPr>
+      <w:r>
+        <w:rPr>
+          <w:rFonts w:ascii="Consolas" w:hAnsi="Consolas"/>
+          <w:color w:val="1A1A1A"/>
+          <w:sz w:val="17"/>
+        </w:rPr>
+        <w:t>Get-Content .env | Where-Object { $_ -match '^\s*[^#].+=' } | ForEach-Object { $k,$v = $_ -split '=',2; [Environment]::SetEnvironmentVariable($k.Trim(), $v.Trim()) }</w:t>
+      </w:r>
+    </w:p>
+    <w:p>
+      <w:r>
+        <w:rPr>
+          <w:b/>
+        </w:rPr>
+        <w:t>Scheduling on Windows (optional).</w:t>
+      </w:r>
+      <w:r>
+        <w:t xml:space="preserve"> The </w:t>
+      </w:r>
+      <w:r>
+        <w:rPr>
+          <w:rFonts w:ascii="Consolas" w:hAnsi="Consolas"/>
+          <w:sz w:val="18"/>
+        </w:rPr>
+        <w:t>cron/</w:t>
+      </w:r>
+      <w:r>
+        <w:t xml:space="preserve"> setup is Linux-only. On native Windows, use </w:t>
+      </w:r>
+      <w:r>
+        <w:rPr>
+          <w:b/>
+        </w:rPr>
+        <w:t>Task Scheduler</w:t>
+      </w:r>
+      <w:r>
+        <w:t xml:space="preserve"> to run, on your schedule, a small </w:t>
+      </w:r>
+      <w:r>
+        <w:rPr>
+          <w:rFonts w:ascii="Consolas" w:hAnsi="Consolas"/>
+          <w:sz w:val="18"/>
+        </w:rPr>
+        <w:t>.bat</w:t>
+      </w:r>
+      <w:r>
+        <w:t>/</w:t>
+      </w:r>
+      <w:r>
+        <w:rPr>
+          <w:rFonts w:ascii="Consolas" w:hAnsi="Consolas"/>
+          <w:sz w:val="18"/>
+        </w:rPr>
+        <w:t>.ps1</w:t>
+      </w:r>
+      <w:r>
+        <w:t xml:space="preserve"> that does: </w:t>
+      </w:r>
+      <w:r>
+        <w:rPr>
+          <w:rFonts w:ascii="Consolas" w:hAnsi="Consolas"/>
+          <w:sz w:val="18"/>
+        </w:rPr>
+        <w:t>cd</w:t>
+      </w:r>
+      <w:r>
+        <w:t xml:space="preserve"> to the project → activate the venv → load </w:t>
+      </w:r>
+      <w:r>
+        <w:rPr>
+          <w:rFonts w:ascii="Consolas" w:hAnsi="Consolas"/>
+          <w:sz w:val="18"/>
+        </w:rPr>
+        <w:t>.env</w:t>
+      </w:r>
+      <w:r>
+        <w:t xml:space="preserve"> → </w:t>
+      </w:r>
+      <w:r>
+        <w:rPr>
+          <w:rFonts w:ascii="Consolas" w:hAnsi="Consolas"/>
+          <w:sz w:val="18"/>
+        </w:rPr>
+        <w:t>python -m orchestrator.run_monthly</w:t>
+      </w:r>
+      <w:r>
+        <w:t xml:space="preserve">. (Under WSL2, the normal cron instructions in </w:t>
+      </w:r>
+      <w:r>
+        <w:rPr>
+          <w:rFonts w:ascii="Consolas" w:hAnsi="Consolas"/>
+          <w:sz w:val="18"/>
+        </w:rPr>
+        <w:t>docs/deployment.md</w:t>
+      </w:r>
+      <w:r>
+        <w:t xml:space="preserve"> work.)</w:t>
+      </w:r>
+    </w:p>
+    <w:p>
+      <w:pPr>
+        <w:ind w:left="360"/>
+      </w:pPr>
+      <w:r>
+        <w:rPr>
+          <w:i/>
+        </w:rPr>
+      </w:r>
+      <w:r>
+        <w:rPr>
+          <w:b/>
+          <w:i/>
+        </w:rPr>
+        <w:t>Note on speed:</w:t>
+      </w:r>
+      <w:r>
+        <w:rPr>
+          <w:i/>
+        </w:rPr>
+        <w:t xml:space="preserve"> native Windows and WSL2 perform comparably for this workload. Pick WSL2 if you also want the monthly cron; pick native if you just run it on demand.</w:t>
+      </w:r>
+    </w:p>
+    <w:p>
+      <w:pPr>
+        <w:pStyle w:val="Heading2"/>
+      </w:pPr>
+      <w:r>
         <w:t>WAY 2 — Claude Code assisted setup</w:t>
+      </w:r>
+    </w:p>
+    <w:p>
+      <w:pPr>
+        <w:ind w:left="360"/>
+      </w:pPr>
+      <w:r>
+        <w:rPr>
+          <w:i/>
+        </w:rPr>
+      </w:r>
+      <w:r>
+        <w:rPr>
+          <w:b/>
+          <w:i/>
+        </w:rPr>
+        <w:t>Works on Windows too</w:t>
+      </w:r>
+      <w:r>
+        <w:rPr>
+          <w:i/>
+        </w:rPr>
+        <w:t xml:space="preserve"> — Claude Code runs on Windows (PowerShell or WSL2). It will detect your OS and give you the correct commands automatically. WSL2 is still the smoothest underlying environment.</w:t>
       </w:r>
     </w:p>
     <w:p>

</xml_diff>